<commit_message>
Update: Integrar vulnerabilidades de Ale Modica (Zerologon y BlueKeep) e informe unificado a 13 páginas
</commit_message>
<xml_diff>
--- a/docs/Informe_Ciberseguridad_Cervera_Modica_Completo.docx
+++ b/docs/Informe_Ciberseguridad_Cervera_Modica_Completo.docx
@@ -35,7 +35,7 @@
     </w:p>
     <w:p>
       <w:pPr>
-        <w:spacing w:before="960" w:after="240"/>
+        <w:spacing w:before="880" w:after="240"/>
       </w:pPr>
       <w:r>
         <w:rPr>
@@ -51,17 +51,21 @@
     </w:p>
     <w:p>
       <w:pPr>
-        <w:spacing w:before="120" w:after="2800" w:line="324" w:lineRule="auto"/>
+        <w:spacing w:before="120" w:after="2400" w:line="324" w:lineRule="auto"/>
       </w:pPr>
       <w:r>
         <w:rPr>
           <w:rFonts w:ascii="Arial" w:hAnsi="Arial"/>
           <w:color w:val="4A5568"/>
-          <w:sz w:val="24"/>
+          <w:sz w:val="23"/>
         </w:rPr>
-        <w:t>Investigación de vulnerabilidades: CVE-2017-0144 (EternalBlue),</w:t>
+        <w:t>Investigación de vulnerabilidades críticas: CVE-2017-0144 (EternalBlue),</w:t>
         <w:br/>
-        <w:t>CVE-2021-41773 (Apache HTTP Server) y CVE-2021-44228 (Log4Shell)</w:t>
+        <w:t>CVE-2021-41773 (Apache HTTP Server), CVE-2021-44228 (Log4Shell),</w:t>
+        <w:br/>
+        <w:t>CVE-2020-1472 (Zerologon) y CVE-2019-0708 (BlueKeep)</w:t>
+        <w:br/>
+        <w:t>Análisis en profundidad y auditoría práctica de laboratorio en Kali Linux</w:t>
       </w:r>
     </w:p>
     <w:tbl>
@@ -290,7 +294,7 @@
     </w:p>
     <w:p>
       <w:pPr>
-        <w:spacing w:before="120" w:after="320"/>
+        <w:spacing w:before="120" w:after="280"/>
         <w:pBdr>
           <w:bottom w:val="single" w:sz="12" w:space="4" w:color="1B365D"/>
         </w:pBdr>
@@ -328,8 +332,8 @@
           <w:tcPr>
             <w:tcW w:type="dxa" w:w="7920"/>
             <w:tcMar>
-              <w:top w:w="110" w:type="dxa"/>
-              <w:bottom w:w="65" w:type="dxa"/>
+              <w:top w:w="85" w:type="dxa"/>
+              <w:bottom w:w="45" w:type="dxa"/>
               <w:left w:w="60" w:type="dxa"/>
               <w:right w:w="60" w:type="dxa"/>
             </w:tcMar>
@@ -343,7 +347,7 @@
               <w:rPr>
                 <w:b/>
                 <w:color w:val="1B365D"/>
-                <w:sz w:val="21"/>
+                <w:sz w:val="20"/>
               </w:rPr>
               <w:t>1. Investigación de vulnerabilidades</w:t>
             </w:r>
@@ -353,8 +357,8 @@
           <w:tcPr>
             <w:tcW w:type="dxa" w:w="1152"/>
             <w:tcMar>
-              <w:top w:w="110" w:type="dxa"/>
-              <w:bottom w:w="65" w:type="dxa"/>
+              <w:top w:w="85" w:type="dxa"/>
+              <w:bottom w:w="45" w:type="dxa"/>
               <w:left w:w="60" w:type="dxa"/>
               <w:right w:w="60" w:type="dxa"/>
             </w:tcMar>
@@ -369,7 +373,7 @@
               <w:rPr>
                 <w:b/>
                 <w:color w:val="1B365D"/>
-                <w:sz w:val="21"/>
+                <w:sz w:val="20"/>
               </w:rPr>
               <w:t>3</w:t>
             </w:r>
@@ -381,9 +385,9 @@
           <w:tcPr>
             <w:tcW w:type="dxa" w:w="7920"/>
             <w:tcMar>
-              <w:top w:w="65" w:type="dxa"/>
-              <w:bottom w:w="65" w:type="dxa"/>
-              <w:left w:w="240" w:type="dxa"/>
+              <w:top w:w="50" w:type="dxa"/>
+              <w:bottom w:w="45" w:type="dxa"/>
+              <w:left w:w="220" w:type="dxa"/>
               <w:right w:w="60" w:type="dxa"/>
             </w:tcMar>
           </w:tcPr>
@@ -395,7 +399,7 @@
               <w:rPr>
                 <w:b w:val="0"/>
                 <w:color w:val="1E1E1E"/>
-                <w:sz w:val="20"/>
+                <w:sz w:val="19"/>
               </w:rPr>
               <w:t>1.1. CVE-2017-0144 (EternalBlue)</w:t>
             </w:r>
@@ -405,8 +409,8 @@
           <w:tcPr>
             <w:tcW w:type="dxa" w:w="1152"/>
             <w:tcMar>
-              <w:top w:w="65" w:type="dxa"/>
-              <w:bottom w:w="65" w:type="dxa"/>
+              <w:top w:w="50" w:type="dxa"/>
+              <w:bottom w:w="45" w:type="dxa"/>
               <w:left w:w="60" w:type="dxa"/>
               <w:right w:w="60" w:type="dxa"/>
             </w:tcMar>
@@ -420,7 +424,7 @@
               <w:rPr>
                 <w:b w:val="0"/>
                 <w:color w:val="4A5568"/>
-                <w:sz w:val="20"/>
+                <w:sz w:val="19"/>
               </w:rPr>
               <w:t>3</w:t>
             </w:r>
@@ -432,9 +436,9 @@
           <w:tcPr>
             <w:tcW w:type="dxa" w:w="7920"/>
             <w:tcMar>
-              <w:top w:w="65" w:type="dxa"/>
-              <w:bottom w:w="65" w:type="dxa"/>
-              <w:left w:w="240" w:type="dxa"/>
+              <w:top w:w="50" w:type="dxa"/>
+              <w:bottom w:w="45" w:type="dxa"/>
+              <w:left w:w="220" w:type="dxa"/>
               <w:right w:w="60" w:type="dxa"/>
             </w:tcMar>
           </w:tcPr>
@@ -446,7 +450,7 @@
               <w:rPr>
                 <w:b w:val="0"/>
                 <w:color w:val="1E1E1E"/>
-                <w:sz w:val="20"/>
+                <w:sz w:val="19"/>
               </w:rPr>
               <w:t>1.2. CVE-2021-41773: Apache HTTP Server (Path Traversal y RCE)</w:t>
             </w:r>
@@ -456,8 +460,8 @@
           <w:tcPr>
             <w:tcW w:type="dxa" w:w="1152"/>
             <w:tcMar>
-              <w:top w:w="65" w:type="dxa"/>
-              <w:bottom w:w="65" w:type="dxa"/>
+              <w:top w:w="50" w:type="dxa"/>
+              <w:bottom w:w="45" w:type="dxa"/>
               <w:left w:w="60" w:type="dxa"/>
               <w:right w:w="60" w:type="dxa"/>
             </w:tcMar>
@@ -471,7 +475,7 @@
               <w:rPr>
                 <w:b w:val="0"/>
                 <w:color w:val="4A5568"/>
-                <w:sz w:val="20"/>
+                <w:sz w:val="19"/>
               </w:rPr>
               <w:t>4</w:t>
             </w:r>
@@ -483,9 +487,9 @@
           <w:tcPr>
             <w:tcW w:type="dxa" w:w="7920"/>
             <w:tcMar>
-              <w:top w:w="65" w:type="dxa"/>
-              <w:bottom w:w="65" w:type="dxa"/>
-              <w:left w:w="240" w:type="dxa"/>
+              <w:top w:w="50" w:type="dxa"/>
+              <w:bottom w:w="45" w:type="dxa"/>
+              <w:left w:w="220" w:type="dxa"/>
               <w:right w:w="60" w:type="dxa"/>
             </w:tcMar>
           </w:tcPr>
@@ -497,7 +501,7 @@
               <w:rPr>
                 <w:b w:val="0"/>
                 <w:color w:val="1E1E1E"/>
-                <w:sz w:val="20"/>
+                <w:sz w:val="19"/>
               </w:rPr>
               <w:t>1.3. CVE-2021-44228: Vulnerabilidad Log4Shell en Apache Log4j</w:t>
             </w:r>
@@ -507,8 +511,8 @@
           <w:tcPr>
             <w:tcW w:type="dxa" w:w="1152"/>
             <w:tcMar>
-              <w:top w:w="65" w:type="dxa"/>
-              <w:bottom w:w="65" w:type="dxa"/>
+              <w:top w:w="50" w:type="dxa"/>
+              <w:bottom w:w="45" w:type="dxa"/>
               <w:left w:w="60" w:type="dxa"/>
               <w:right w:w="60" w:type="dxa"/>
             </w:tcMar>
@@ -522,7 +526,7 @@
               <w:rPr>
                 <w:b w:val="0"/>
                 <w:color w:val="4A5568"/>
-                <w:sz w:val="20"/>
+                <w:sz w:val="19"/>
               </w:rPr>
               <w:t>5</w:t>
             </w:r>
@@ -534,8 +538,110 @@
           <w:tcPr>
             <w:tcW w:type="dxa" w:w="7920"/>
             <w:tcMar>
-              <w:top w:w="110" w:type="dxa"/>
-              <w:bottom w:w="65" w:type="dxa"/>
+              <w:top w:w="50" w:type="dxa"/>
+              <w:bottom w:w="45" w:type="dxa"/>
+              <w:left w:w="220" w:type="dxa"/>
+              <w:right w:w="60" w:type="dxa"/>
+            </w:tcMar>
+          </w:tcPr>
+          <w:p>
+            <w:pPr>
+              <w:spacing w:after="0"/>
+            </w:pPr>
+            <w:r>
+              <w:rPr>
+                <w:b w:val="0"/>
+                <w:color w:val="1E1E1E"/>
+                <w:sz w:val="19"/>
+              </w:rPr>
+              <w:t>1.4. CVE-2020-1472: Zerologon en Active Directory</w:t>
+            </w:r>
+          </w:p>
+        </w:tc>
+        <w:tc>
+          <w:tcPr>
+            <w:tcW w:type="dxa" w:w="1152"/>
+            <w:tcMar>
+              <w:top w:w="50" w:type="dxa"/>
+              <w:bottom w:w="45" w:type="dxa"/>
+              <w:left w:w="60" w:type="dxa"/>
+              <w:right w:w="60" w:type="dxa"/>
+            </w:tcMar>
+          </w:tcPr>
+          <w:p>
+            <w:pPr>
+              <w:spacing w:after="0"/>
+              <w:jc w:val="right"/>
+            </w:pPr>
+            <w:r>
+              <w:rPr>
+                <w:b w:val="0"/>
+                <w:color w:val="4A5568"/>
+                <w:sz w:val="19"/>
+              </w:rPr>
+              <w:t>6</w:t>
+            </w:r>
+          </w:p>
+        </w:tc>
+      </w:tr>
+      <w:tr>
+        <w:tc>
+          <w:tcPr>
+            <w:tcW w:type="dxa" w:w="7920"/>
+            <w:tcMar>
+              <w:top w:w="50" w:type="dxa"/>
+              <w:bottom w:w="45" w:type="dxa"/>
+              <w:left w:w="220" w:type="dxa"/>
+              <w:right w:w="60" w:type="dxa"/>
+            </w:tcMar>
+          </w:tcPr>
+          <w:p>
+            <w:pPr>
+              <w:spacing w:after="0"/>
+            </w:pPr>
+            <w:r>
+              <w:rPr>
+                <w:b w:val="0"/>
+                <w:color w:val="1E1E1E"/>
+                <w:sz w:val="19"/>
+              </w:rPr>
+              <w:t>1.5. CVE-2019-0708: BlueKeep en Escritorio Remoto (RDP)</w:t>
+            </w:r>
+          </w:p>
+        </w:tc>
+        <w:tc>
+          <w:tcPr>
+            <w:tcW w:type="dxa" w:w="1152"/>
+            <w:tcMar>
+              <w:top w:w="50" w:type="dxa"/>
+              <w:bottom w:w="45" w:type="dxa"/>
+              <w:left w:w="60" w:type="dxa"/>
+              <w:right w:w="60" w:type="dxa"/>
+            </w:tcMar>
+          </w:tcPr>
+          <w:p>
+            <w:pPr>
+              <w:spacing w:after="0"/>
+              <w:jc w:val="right"/>
+            </w:pPr>
+            <w:r>
+              <w:rPr>
+                <w:b w:val="0"/>
+                <w:color w:val="4A5568"/>
+                <w:sz w:val="19"/>
+              </w:rPr>
+              <w:t>7</w:t>
+            </w:r>
+          </w:p>
+        </w:tc>
+      </w:tr>
+      <w:tr>
+        <w:tc>
+          <w:tcPr>
+            <w:tcW w:type="dxa" w:w="7920"/>
+            <w:tcMar>
+              <w:top w:w="85" w:type="dxa"/>
+              <w:bottom w:w="45" w:type="dxa"/>
               <w:left w:w="60" w:type="dxa"/>
               <w:right w:w="60" w:type="dxa"/>
             </w:tcMar>
@@ -549,7 +655,7 @@
               <w:rPr>
                 <w:b/>
                 <w:color w:val="1B365D"/>
-                <w:sz w:val="21"/>
+                <w:sz w:val="20"/>
               </w:rPr>
               <w:t>2. Análisis de una vulnerabilidad I (CVE-2021-41773 - Apache)</w:t>
             </w:r>
@@ -559,8 +665,8 @@
           <w:tcPr>
             <w:tcW w:type="dxa" w:w="1152"/>
             <w:tcMar>
-              <w:top w:w="110" w:type="dxa"/>
-              <w:bottom w:w="65" w:type="dxa"/>
+              <w:top w:w="85" w:type="dxa"/>
+              <w:bottom w:w="45" w:type="dxa"/>
               <w:left w:w="60" w:type="dxa"/>
               <w:right w:w="60" w:type="dxa"/>
             </w:tcMar>
@@ -575,9 +681,9 @@
               <w:rPr>
                 <w:b/>
                 <w:color w:val="1B365D"/>
-                <w:sz w:val="21"/>
+                <w:sz w:val="20"/>
               </w:rPr>
-              <w:t>6</w:t>
+              <w:t>8</w:t>
             </w:r>
           </w:p>
         </w:tc>
@@ -587,9 +693,9 @@
           <w:tcPr>
             <w:tcW w:type="dxa" w:w="7920"/>
             <w:tcMar>
-              <w:top w:w="65" w:type="dxa"/>
-              <w:bottom w:w="65" w:type="dxa"/>
-              <w:left w:w="240" w:type="dxa"/>
+              <w:top w:w="50" w:type="dxa"/>
+              <w:bottom w:w="45" w:type="dxa"/>
+              <w:left w:w="220" w:type="dxa"/>
               <w:right w:w="60" w:type="dxa"/>
             </w:tcMar>
           </w:tcPr>
@@ -601,7 +707,7 @@
               <w:rPr>
                 <w:b w:val="0"/>
                 <w:color w:val="1E1E1E"/>
-                <w:sz w:val="20"/>
+                <w:sz w:val="19"/>
               </w:rPr>
               <w:t>2.1. Causas de la vulnerabilidad</w:t>
             </w:r>
@@ -611,8 +717,8 @@
           <w:tcPr>
             <w:tcW w:type="dxa" w:w="1152"/>
             <w:tcMar>
-              <w:top w:w="65" w:type="dxa"/>
-              <w:bottom w:w="65" w:type="dxa"/>
+              <w:top w:w="50" w:type="dxa"/>
+              <w:bottom w:w="45" w:type="dxa"/>
               <w:left w:w="60" w:type="dxa"/>
               <w:right w:w="60" w:type="dxa"/>
             </w:tcMar>
@@ -626,9 +732,9 @@
               <w:rPr>
                 <w:b w:val="0"/>
                 <w:color w:val="4A5568"/>
-                <w:sz w:val="20"/>
+                <w:sz w:val="19"/>
               </w:rPr>
-              <w:t>6</w:t>
+              <w:t>8</w:t>
             </w:r>
           </w:p>
         </w:tc>
@@ -638,9 +744,9 @@
           <w:tcPr>
             <w:tcW w:type="dxa" w:w="7920"/>
             <w:tcMar>
-              <w:top w:w="65" w:type="dxa"/>
-              <w:bottom w:w="65" w:type="dxa"/>
-              <w:left w:w="240" w:type="dxa"/>
+              <w:top w:w="50" w:type="dxa"/>
+              <w:bottom w:w="45" w:type="dxa"/>
+              <w:left w:w="220" w:type="dxa"/>
               <w:right w:w="60" w:type="dxa"/>
             </w:tcMar>
           </w:tcPr>
@@ -652,7 +758,7 @@
               <w:rPr>
                 <w:b w:val="0"/>
                 <w:color w:val="1E1E1E"/>
-                <w:sz w:val="20"/>
+                <w:sz w:val="19"/>
               </w:rPr>
               <w:t>2.2. Herramientas para analizar y detectar la vulnerabilidad</w:t>
             </w:r>
@@ -662,8 +768,8 @@
           <w:tcPr>
             <w:tcW w:type="dxa" w:w="1152"/>
             <w:tcMar>
-              <w:top w:w="65" w:type="dxa"/>
-              <w:bottom w:w="65" w:type="dxa"/>
+              <w:top w:w="50" w:type="dxa"/>
+              <w:bottom w:w="45" w:type="dxa"/>
               <w:left w:w="60" w:type="dxa"/>
               <w:right w:w="60" w:type="dxa"/>
             </w:tcMar>
@@ -677,9 +783,9 @@
               <w:rPr>
                 <w:b w:val="0"/>
                 <w:color w:val="4A5568"/>
-                <w:sz w:val="20"/>
+                <w:sz w:val="19"/>
               </w:rPr>
-              <w:t>6</w:t>
+              <w:t>8</w:t>
             </w:r>
           </w:p>
         </w:tc>
@@ -689,9 +795,9 @@
           <w:tcPr>
             <w:tcW w:type="dxa" w:w="7920"/>
             <w:tcMar>
-              <w:top w:w="65" w:type="dxa"/>
-              <w:bottom w:w="65" w:type="dxa"/>
-              <w:left w:w="240" w:type="dxa"/>
+              <w:top w:w="50" w:type="dxa"/>
+              <w:bottom w:w="45" w:type="dxa"/>
+              <w:left w:w="220" w:type="dxa"/>
               <w:right w:w="60" w:type="dxa"/>
             </w:tcMar>
           </w:tcPr>
@@ -703,7 +809,7 @@
               <w:rPr>
                 <w:b w:val="0"/>
                 <w:color w:val="1E1E1E"/>
-                <w:sz w:val="20"/>
+                <w:sz w:val="19"/>
               </w:rPr>
               <w:t>2.3. Propuesta de solución justificada</w:t>
             </w:r>
@@ -713,8 +819,8 @@
           <w:tcPr>
             <w:tcW w:type="dxa" w:w="1152"/>
             <w:tcMar>
-              <w:top w:w="65" w:type="dxa"/>
-              <w:bottom w:w="65" w:type="dxa"/>
+              <w:top w:w="50" w:type="dxa"/>
+              <w:bottom w:w="45" w:type="dxa"/>
               <w:left w:w="60" w:type="dxa"/>
               <w:right w:w="60" w:type="dxa"/>
             </w:tcMar>
@@ -728,9 +834,9 @@
               <w:rPr>
                 <w:b w:val="0"/>
                 <w:color w:val="4A5568"/>
-                <w:sz w:val="20"/>
+                <w:sz w:val="19"/>
               </w:rPr>
-              <w:t>6</w:t>
+              <w:t>8</w:t>
             </w:r>
           </w:p>
         </w:tc>
@@ -740,8 +846,8 @@
           <w:tcPr>
             <w:tcW w:type="dxa" w:w="7920"/>
             <w:tcMar>
-              <w:top w:w="110" w:type="dxa"/>
-              <w:bottom w:w="65" w:type="dxa"/>
+              <w:top w:w="85" w:type="dxa"/>
+              <w:bottom w:w="45" w:type="dxa"/>
               <w:left w:w="60" w:type="dxa"/>
               <w:right w:w="60" w:type="dxa"/>
             </w:tcMar>
@@ -755,7 +861,7 @@
               <w:rPr>
                 <w:b/>
                 <w:color w:val="1B365D"/>
-                <w:sz w:val="21"/>
+                <w:sz w:val="20"/>
               </w:rPr>
               <w:t>3. Detección o demostración de la vulnerabilidad II (Laboratorio Kali Linux)</w:t>
             </w:r>
@@ -765,8 +871,8 @@
           <w:tcPr>
             <w:tcW w:type="dxa" w:w="1152"/>
             <w:tcMar>
-              <w:top w:w="110" w:type="dxa"/>
-              <w:bottom w:w="65" w:type="dxa"/>
+              <w:top w:w="85" w:type="dxa"/>
+              <w:bottom w:w="45" w:type="dxa"/>
               <w:left w:w="60" w:type="dxa"/>
               <w:right w:w="60" w:type="dxa"/>
             </w:tcMar>
@@ -781,9 +887,9 @@
               <w:rPr>
                 <w:b/>
                 <w:color w:val="1B365D"/>
-                <w:sz w:val="21"/>
+                <w:sz w:val="20"/>
               </w:rPr>
-              <w:t>7</w:t>
+              <w:t>9</w:t>
             </w:r>
           </w:p>
         </w:tc>
@@ -793,9 +899,9 @@
           <w:tcPr>
             <w:tcW w:type="dxa" w:w="7920"/>
             <w:tcMar>
-              <w:top w:w="65" w:type="dxa"/>
-              <w:bottom w:w="65" w:type="dxa"/>
-              <w:left w:w="240" w:type="dxa"/>
+              <w:top w:w="50" w:type="dxa"/>
+              <w:bottom w:w="45" w:type="dxa"/>
+              <w:left w:w="220" w:type="dxa"/>
               <w:right w:w="60" w:type="dxa"/>
             </w:tcMar>
           </w:tcPr>
@@ -807,7 +913,7 @@
               <w:rPr>
                 <w:b w:val="0"/>
                 <w:color w:val="1E1E1E"/>
-                <w:sz w:val="20"/>
+                <w:sz w:val="19"/>
               </w:rPr>
               <w:t>3.1. Identificación de versiones con Nmap y auditoría de configuración</w:t>
             </w:r>
@@ -817,8 +923,8 @@
           <w:tcPr>
             <w:tcW w:type="dxa" w:w="1152"/>
             <w:tcMar>
-              <w:top w:w="65" w:type="dxa"/>
-              <w:bottom w:w="65" w:type="dxa"/>
+              <w:top w:w="50" w:type="dxa"/>
+              <w:bottom w:w="45" w:type="dxa"/>
               <w:left w:w="60" w:type="dxa"/>
               <w:right w:w="60" w:type="dxa"/>
             </w:tcMar>
@@ -832,9 +938,9 @@
               <w:rPr>
                 <w:b w:val="0"/>
                 <w:color w:val="4A5568"/>
-                <w:sz w:val="20"/>
+                <w:sz w:val="19"/>
               </w:rPr>
-              <w:t>7</w:t>
+              <w:t>9</w:t>
             </w:r>
           </w:p>
         </w:tc>
@@ -844,9 +950,9 @@
           <w:tcPr>
             <w:tcW w:type="dxa" w:w="7920"/>
             <w:tcMar>
-              <w:top w:w="65" w:type="dxa"/>
-              <w:bottom w:w="65" w:type="dxa"/>
-              <w:left w:w="240" w:type="dxa"/>
+              <w:top w:w="50" w:type="dxa"/>
+              <w:bottom w:w="45" w:type="dxa"/>
+              <w:left w:w="220" w:type="dxa"/>
               <w:right w:w="60" w:type="dxa"/>
             </w:tcMar>
           </w:tcPr>
@@ -858,7 +964,7 @@
               <w:rPr>
                 <w:b w:val="0"/>
                 <w:color w:val="1E1E1E"/>
-                <w:sz w:val="20"/>
+                <w:sz w:val="19"/>
               </w:rPr>
               <w:t>3.2. Verificación del servicio web y bloqueo del retroceso estándar (../)</w:t>
             </w:r>
@@ -868,8 +974,8 @@
           <w:tcPr>
             <w:tcW w:type="dxa" w:w="1152"/>
             <w:tcMar>
-              <w:top w:w="65" w:type="dxa"/>
-              <w:bottom w:w="65" w:type="dxa"/>
+              <w:top w:w="50" w:type="dxa"/>
+              <w:bottom w:w="45" w:type="dxa"/>
               <w:left w:w="60" w:type="dxa"/>
               <w:right w:w="60" w:type="dxa"/>
             </w:tcMar>
@@ -883,9 +989,9 @@
               <w:rPr>
                 <w:b w:val="0"/>
                 <w:color w:val="4A5568"/>
-                <w:sz w:val="20"/>
+                <w:sz w:val="19"/>
               </w:rPr>
-              <w:t>8</w:t>
+              <w:t>10</w:t>
             </w:r>
           </w:p>
         </w:tc>
@@ -895,9 +1001,9 @@
           <w:tcPr>
             <w:tcW w:type="dxa" w:w="7920"/>
             <w:tcMar>
-              <w:top w:w="65" w:type="dxa"/>
-              <w:bottom w:w="65" w:type="dxa"/>
-              <w:left w:w="240" w:type="dxa"/>
+              <w:top w:w="50" w:type="dxa"/>
+              <w:bottom w:w="45" w:type="dxa"/>
+              <w:left w:w="220" w:type="dxa"/>
               <w:right w:w="60" w:type="dxa"/>
             </w:tcMar>
           </w:tcPr>
@@ -909,7 +1015,7 @@
               <w:rPr>
                 <w:b w:val="0"/>
                 <w:color w:val="1E1E1E"/>
-                <w:sz w:val="20"/>
+                <w:sz w:val="19"/>
               </w:rPr>
               <w:t>3.3. Demostración de la vulnerabilidad CVE-2021-41773 en Apache 2.4.49</w:t>
             </w:r>
@@ -919,8 +1025,8 @@
           <w:tcPr>
             <w:tcW w:type="dxa" w:w="1152"/>
             <w:tcMar>
-              <w:top w:w="65" w:type="dxa"/>
-              <w:bottom w:w="65" w:type="dxa"/>
+              <w:top w:w="50" w:type="dxa"/>
+              <w:bottom w:w="45" w:type="dxa"/>
               <w:left w:w="60" w:type="dxa"/>
               <w:right w:w="60" w:type="dxa"/>
             </w:tcMar>
@@ -934,9 +1040,9 @@
               <w:rPr>
                 <w:b w:val="0"/>
                 <w:color w:val="4A5568"/>
-                <w:sz w:val="20"/>
+                <w:sz w:val="19"/>
               </w:rPr>
-              <w:t>9</w:t>
+              <w:t>11</w:t>
             </w:r>
           </w:p>
         </w:tc>
@@ -946,9 +1052,9 @@
           <w:tcPr>
             <w:tcW w:type="dxa" w:w="7920"/>
             <w:tcMar>
-              <w:top w:w="65" w:type="dxa"/>
-              <w:bottom w:w="65" w:type="dxa"/>
-              <w:left w:w="240" w:type="dxa"/>
+              <w:top w:w="50" w:type="dxa"/>
+              <w:bottom w:w="45" w:type="dxa"/>
+              <w:left w:w="220" w:type="dxa"/>
               <w:right w:w="60" w:type="dxa"/>
             </w:tcMar>
           </w:tcPr>
@@ -960,7 +1066,7 @@
               <w:rPr>
                 <w:b w:val="0"/>
                 <w:color w:val="1E1E1E"/>
-                <w:sz w:val="20"/>
+                <w:sz w:val="19"/>
               </w:rPr>
               <w:t>3.4. Verificación de la mitigación en la versión parcheada (Apache 2.4.68)</w:t>
             </w:r>
@@ -970,8 +1076,8 @@
           <w:tcPr>
             <w:tcW w:type="dxa" w:w="1152"/>
             <w:tcMar>
-              <w:top w:w="65" w:type="dxa"/>
-              <w:bottom w:w="65" w:type="dxa"/>
+              <w:top w:w="50" w:type="dxa"/>
+              <w:bottom w:w="45" w:type="dxa"/>
               <w:left w:w="60" w:type="dxa"/>
               <w:right w:w="60" w:type="dxa"/>
             </w:tcMar>
@@ -985,9 +1091,9 @@
               <w:rPr>
                 <w:b w:val="0"/>
                 <w:color w:val="4A5568"/>
-                <w:sz w:val="20"/>
+                <w:sz w:val="19"/>
               </w:rPr>
-              <w:t>10</w:t>
+              <w:t>12</w:t>
             </w:r>
           </w:p>
         </w:tc>
@@ -997,8 +1103,8 @@
           <w:tcPr>
             <w:tcW w:type="dxa" w:w="7920"/>
             <w:tcMar>
-              <w:top w:w="110" w:type="dxa"/>
-              <w:bottom w:w="65" w:type="dxa"/>
+              <w:top w:w="85" w:type="dxa"/>
+              <w:bottom w:w="45" w:type="dxa"/>
               <w:left w:w="60" w:type="dxa"/>
               <w:right w:w="60" w:type="dxa"/>
             </w:tcMar>
@@ -1012,7 +1118,7 @@
               <w:rPr>
                 <w:b/>
                 <w:color w:val="1B365D"/>
-                <w:sz w:val="21"/>
+                <w:sz w:val="20"/>
               </w:rPr>
               <w:t>4. Fuentes Consultadas</w:t>
             </w:r>
@@ -1022,8 +1128,8 @@
           <w:tcPr>
             <w:tcW w:type="dxa" w:w="1152"/>
             <w:tcMar>
-              <w:top w:w="110" w:type="dxa"/>
-              <w:bottom w:w="65" w:type="dxa"/>
+              <w:top w:w="85" w:type="dxa"/>
+              <w:bottom w:w="45" w:type="dxa"/>
               <w:left w:w="60" w:type="dxa"/>
               <w:right w:w="60" w:type="dxa"/>
             </w:tcMar>
@@ -1038,9 +1144,9 @@
               <w:rPr>
                 <w:b/>
                 <w:color w:val="1B365D"/>
-                <w:sz w:val="21"/>
+                <w:sz w:val="20"/>
               </w:rPr>
-              <w:t>11</w:t>
+              <w:t>13</w:t>
             </w:r>
           </w:p>
         </w:tc>
@@ -1288,7 +1394,7 @@
           <w:color w:val="1B365D"/>
           <w:sz w:val="21"/>
         </w:rPr>
-        <w:t>Impacto:</w:t>
+        <w:t>Impacto y ejemplos reales de explotación:</w:t>
       </w:r>
     </w:p>
     <w:p>
@@ -1306,9 +1412,43 @@
       </w:r>
       <w:r>
         <w:rPr>
+          <w:b/>
           <w:color w:val="1E1E1E"/>
         </w:rPr>
-        <w:t>Robo de información confidencial y credenciales, instalación de puertas traseras a nivel Kernel, “pantallas azules” (BSOD) y paralización del negocio por cifrado (ransomware).</w:t>
+        <w:t xml:space="preserve">WannaCry (mayo de 2017): </w:t>
+      </w:r>
+      <w:r>
+        <w:rPr>
+          <w:color w:val="1E1E1E"/>
+        </w:rPr>
+        <w:t>Infectó a más de 200.000 equipos en 150 países en cuestión de horas. Paralizó hospitales del NHS británico, plantas automotrices y empresas de telecomunicaciones (como Telefónica) cifrando discos duros y pidiendo rescates en Bitcoin.</w:t>
+      </w:r>
+    </w:p>
+    <w:p>
+      <w:pPr>
+        <w:spacing w:after="60" w:line="278" w:lineRule="auto"/>
+        <w:ind w:left="360" w:hanging="216"/>
+        <w:jc w:val="both"/>
+      </w:pPr>
+      <w:r>
+        <w:rPr>
+          <w:b/>
+          <w:color w:val="1B365D"/>
+        </w:rPr>
+        <w:t xml:space="preserve">•  </w:t>
+      </w:r>
+      <w:r>
+        <w:rPr>
+          <w:b/>
+          <w:color w:val="1E1E1E"/>
+        </w:rPr>
+        <w:t xml:space="preserve">NotPetya (junio de 2017): </w:t>
+      </w:r>
+      <w:r>
+        <w:rPr>
+          <w:color w:val="1E1E1E"/>
+        </w:rPr>
+        <w:t>Disfrazado de ransomware, funcionó como un limpiador (wiper) destructivo. Afectó a la naviera global Maersk, paralizando terminales portuarias enteras y causando pérdidas estimadas en más de 10.000 millones de dólares.</w:t>
       </w:r>
     </w:p>
     <w:p>
@@ -1350,8 +1490,83 @@
         <w:rPr>
           <w:color w:val="1E1E1E"/>
         </w:rPr>
-        <w:t>Aplicar el mencionado boletín MS17-010 y desactivar el protocolo SMBv1 exigiendo SMBv2 en adelante.</w:t>
+        <w:t>Aplicar el mencionado boletín MS17-010.</w:t>
       </w:r>
+    </w:p>
+    <w:p>
+      <w:pPr>
+        <w:spacing w:after="60" w:line="278" w:lineRule="auto"/>
+        <w:ind w:left="360" w:hanging="216"/>
+        <w:jc w:val="both"/>
+      </w:pPr>
+      <w:r>
+        <w:rPr>
+          <w:b/>
+          <w:color w:val="1B365D"/>
+        </w:rPr>
+        <w:t xml:space="preserve">•  </w:t>
+      </w:r>
+      <w:r>
+        <w:rPr>
+          <w:b/>
+          <w:color w:val="1E1E1E"/>
+        </w:rPr>
+        <w:t xml:space="preserve">Deshabilitación de SMBv1: </w:t>
+      </w:r>
+      <w:r>
+        <w:rPr>
+          <w:color w:val="1E1E1E"/>
+        </w:rPr>
+        <w:t>SMBv1 es un protocolo obsoleto. Se debe deshabilitar por completo mediante PowerShell o GPO forzando el uso exclusivo de SMBv2/v3:</w:t>
+      </w:r>
+    </w:p>
+    <w:tbl>
+      <w:tblPr>
+        <w:tblW w:type="auto" w:w="0"/>
+        <w:jc w:val="center"/>
+        <w:tblLook w:firstColumn="1" w:firstRow="1" w:lastColumn="0" w:lastRow="0" w:noHBand="0" w:noVBand="1" w:val="04A0"/>
+        <w:tblBorders>
+          <w:top w:val="single" w:sz="4" w:space="0" w:color="CBD5E1"/>
+          <w:bottom w:val="single" w:sz="4" w:space="0" w:color="CBD5E1"/>
+          <w:left w:val="single" w:sz="16" w:space="0" w:color="1B365D"/>
+          <w:right w:val="single" w:sz="4" w:space="0" w:color="CBD5E1"/>
+        </w:tblBorders>
+      </w:tblPr>
+      <w:tblGrid>
+        <w:gridCol w:w="9216"/>
+      </w:tblGrid>
+      <w:tr>
+        <w:tc>
+          <w:tcPr>
+            <w:tcW w:type="dxa" w:w="8784"/>
+            <w:shd w:fill="F1F5F9"/>
+            <w:tcMar>
+              <w:top w:w="70" w:type="dxa"/>
+              <w:bottom w:w="70" w:type="dxa"/>
+              <w:left w:w="140" w:type="dxa"/>
+              <w:right w:w="140" w:type="dxa"/>
+            </w:tcMar>
+          </w:tcPr>
+          <w:p>
+            <w:pPr>
+              <w:spacing w:after="0" w:line="276" w:lineRule="auto"/>
+            </w:pPr>
+            <w:r>
+              <w:rPr>
+                <w:rFonts w:ascii="Courier New" w:hAnsi="Courier New"/>
+                <w:color w:val="1E1E1E"/>
+                <w:sz w:val="19"/>
+              </w:rPr>
+              <w:t>Disable-WindowsOptionalFeature -Online -FeatureName SMB1Protocol</w:t>
+            </w:r>
+          </w:p>
+        </w:tc>
+      </w:tr>
+    </w:tbl>
+    <w:p>
+      <w:pPr>
+        <w:spacing w:before="0" w:after="60"/>
+      </w:pPr>
     </w:p>
     <w:p>
       <w:pPr>
@@ -2060,6 +2275,493 @@
           <w:color w:val="1E1E1E"/>
         </w:rPr>
         <w:t>Actualizar Log4j a la versión 2.17.1 o superior, o iniciar la máquina virtual del proceso de Java con el parámetro “-Dlog4j2.formatMsgNoLookups=true”, además de bloquear conexiones salientes LDAP (puerto TCP 389) en el firewall perimetral.</w:t>
+      </w:r>
+    </w:p>
+    <w:p>
+      <w:pPr>
+        <w:keepNext/>
+        <w:spacing w:before="220" w:after="80"/>
+      </w:pPr>
+      <w:r>
+        <w:rPr>
+          <w:rFonts w:ascii="Arial" w:hAnsi="Arial"/>
+          <w:b/>
+          <w:color w:val="1B365D"/>
+          <w:sz w:val="24"/>
+        </w:rPr>
+        <w:t>1.4. CVE-2020-1472: Zerologon en Controladores de Dominio Active Directory</w:t>
+      </w:r>
+    </w:p>
+    <w:p>
+      <w:pPr>
+        <w:spacing w:after="90" w:line="283" w:lineRule="auto"/>
+        <w:jc w:val="both"/>
+      </w:pPr>
+      <w:r>
+        <w:rPr>
+          <w:b/>
+          <w:color w:val="1E1E1E"/>
+        </w:rPr>
+        <w:t xml:space="preserve">¿Qué se ve afectado y de qué manera? </w:t>
+      </w:r>
+      <w:r>
+        <w:rPr>
+          <w:i w:val="0"/>
+          <w:color w:val="1E1E1E"/>
+        </w:rPr>
+        <w:t>Afecta a los servidores que actúan como Controladores de Dominio (Domain Controllers) en entornos de Active Directory (Windows Server 2008 R2 hasta Windows Server 2019).</w:t>
+      </w:r>
+    </w:p>
+    <w:p>
+      <w:pPr>
+        <w:spacing w:after="90" w:line="283" w:lineRule="auto"/>
+        <w:jc w:val="both"/>
+      </w:pPr>
+      <w:r>
+        <w:rPr>
+          <w:i w:val="0"/>
+          <w:color w:val="1E1E1E"/>
+        </w:rPr>
+        <w:t>El problema radica en una falla criptográfica grave dentro del protocolo Netlogon Remote Protocol (MS-NRPC), utilizado para autenticar usuarios y máquinas dentro del dominio. Microsoft implementó el modo AES-CFB8 pero fijó el vector de inicialización (IV) en un valor constante de 16 ceros en lugar de generar un vector aleatorio para cada sesión. Criptográficamente, esto significa que tras una media de 256 intentos de conexión (un ataque de fuerza bruta que toma unos 3 a 5 segundos), un atacante puede autenticarse sin conocer la clave secreta y solicitar el cambio de contraseña de la cuenta del equipo del propio Controlador de Dominio, cambiándola a un valor vacío o nulo.</w:t>
+      </w:r>
+    </w:p>
+    <w:p>
+      <w:pPr>
+        <w:keepNext/>
+        <w:spacing w:before="120" w:after="40"/>
+      </w:pPr>
+      <w:r>
+        <w:rPr>
+          <w:rFonts w:ascii="Arial" w:hAnsi="Arial"/>
+          <w:b/>
+          <w:color w:val="1B365D"/>
+          <w:sz w:val="21"/>
+        </w:rPr>
+        <w:t>Problemática principal:</w:t>
+      </w:r>
+    </w:p>
+    <w:p>
+      <w:pPr>
+        <w:spacing w:after="90" w:line="283" w:lineRule="auto"/>
+        <w:jc w:val="both"/>
+      </w:pPr>
+      <w:r>
+        <w:rPr>
+          <w:i w:val="0"/>
+          <w:color w:val="1E1E1E"/>
+        </w:rPr>
+        <w:t>Es un colapso total de la seguridad de la identidad corporativa. Un atacante con solo un cable de red conectado a una toma física de la oficina (o con acceso a una máquina sin privilegios comprometida por phishing) puede convertir ese acceso mínimo en Domain Admin en menos de un minuto, obteniendo la base de datos NTDS.dit y controlando todas las cuentas, accesos y servidores de la empresa.</w:t>
+      </w:r>
+    </w:p>
+    <w:p>
+      <w:pPr>
+        <w:keepNext/>
+        <w:spacing w:before="120" w:after="40"/>
+      </w:pPr>
+      <w:r>
+        <w:rPr>
+          <w:rFonts w:ascii="Arial" w:hAnsi="Arial"/>
+          <w:b/>
+          <w:color w:val="1B365D"/>
+          <w:sz w:val="21"/>
+        </w:rPr>
+        <w:t>Ejemplos reales de explotación:</w:t>
+      </w:r>
+    </w:p>
+    <w:p>
+      <w:pPr>
+        <w:spacing w:after="60" w:line="278" w:lineRule="auto"/>
+        <w:ind w:left="360" w:hanging="216"/>
+        <w:jc w:val="both"/>
+      </w:pPr>
+      <w:r>
+        <w:rPr>
+          <w:b/>
+          <w:color w:val="1B365D"/>
+        </w:rPr>
+        <w:t xml:space="preserve">•  </w:t>
+      </w:r>
+      <w:r>
+        <w:rPr>
+          <w:b/>
+          <w:color w:val="1E1E1E"/>
+        </w:rPr>
+        <w:t xml:space="preserve">Cadenas de intrusión de Ransomware (Ryuk, Egregor, Conti): </w:t>
+      </w:r>
+      <w:r>
+        <w:rPr>
+          <w:color w:val="1E1E1E"/>
+        </w:rPr>
+        <w:t>En 2020 y 2021, múltiples bandas de ransomware incorporaron Zerologon en sus playbooks de movimiento lateral. Tras obtener acceso inicial mediante troyanos como TrickBot o QakBot, ejecutaban el exploit de Zerologon para adueñarse del Controlador de Dominio casi al instante y desplegar el cifrado en toda la red corporativa mediante GPO.</w:t>
+      </w:r>
+    </w:p>
+    <w:p>
+      <w:pPr>
+        <w:spacing w:after="60" w:line="278" w:lineRule="auto"/>
+        <w:ind w:left="360" w:hanging="216"/>
+        <w:jc w:val="both"/>
+      </w:pPr>
+      <w:r>
+        <w:rPr>
+          <w:b/>
+          <w:color w:val="1B365D"/>
+        </w:rPr>
+        <w:t xml:space="preserve">•  </w:t>
+      </w:r>
+      <w:r>
+        <w:rPr>
+          <w:b/>
+          <w:color w:val="1E1E1E"/>
+        </w:rPr>
+        <w:t xml:space="preserve">Campaña de amenazas persistentes avanzadas (APT): </w:t>
+      </w:r>
+      <w:r>
+        <w:rPr>
+          <w:color w:val="1E1E1E"/>
+        </w:rPr>
+        <w:t>Agencias de ciberseguridad como CISA (EE. UU.) alertaron sobre grupos de ciberespionaje patrocinados por estados que encadenaban vulnerabilidades en VPNs perimetrales con Zerologon para lograr persistencia total en redes gubernamentales.</w:t>
+      </w:r>
+    </w:p>
+    <w:p>
+      <w:pPr>
+        <w:keepNext/>
+        <w:spacing w:before="120" w:after="40"/>
+      </w:pPr>
+      <w:r>
+        <w:rPr>
+          <w:rFonts w:ascii="Arial" w:hAnsi="Arial"/>
+          <w:b/>
+          <w:color w:val="1B365D"/>
+          <w:sz w:val="21"/>
+        </w:rPr>
+        <w:t>Mitigación y prevención:</w:t>
+      </w:r>
+    </w:p>
+    <w:p>
+      <w:pPr>
+        <w:spacing w:after="60" w:line="278" w:lineRule="auto"/>
+        <w:ind w:left="360" w:hanging="216"/>
+        <w:jc w:val="both"/>
+      </w:pPr>
+      <w:r>
+        <w:rPr>
+          <w:b/>
+          <w:color w:val="1B365D"/>
+        </w:rPr>
+        <w:t xml:space="preserve">•  </w:t>
+      </w:r>
+      <w:r>
+        <w:rPr>
+          <w:b/>
+          <w:color w:val="1E1E1E"/>
+        </w:rPr>
+        <w:t xml:space="preserve">Aplicar parches en dos fases (Microsoft Rollout): </w:t>
+      </w:r>
+      <w:r>
+        <w:rPr>
+          <w:color w:val="1E1E1E"/>
+        </w:rPr>
+        <w:t>Instalar las actualizaciones acumulativas de agosto de 2020 y febrero de 2021, las cuales implementaron y forzaron el modo Secure RPC para todas las conexiones Netlogon.</w:t>
+      </w:r>
+    </w:p>
+    <w:p>
+      <w:pPr>
+        <w:spacing w:after="60" w:line="278" w:lineRule="auto"/>
+        <w:ind w:left="360" w:hanging="216"/>
+        <w:jc w:val="both"/>
+      </w:pPr>
+      <w:r>
+        <w:rPr>
+          <w:b/>
+          <w:color w:val="1B365D"/>
+        </w:rPr>
+        <w:t xml:space="preserve">•  </w:t>
+      </w:r>
+      <w:r>
+        <w:rPr>
+          <w:b/>
+          <w:color w:val="1E1E1E"/>
+        </w:rPr>
+        <w:t xml:space="preserve">Forzar canal seguro de Netlogon: </w:t>
+      </w:r>
+      <w:r>
+        <w:rPr>
+          <w:color w:val="1E1E1E"/>
+        </w:rPr>
+        <w:t>Asegurar que la directiva de dominio impida que dispositivos no compatibles o legados utilicen conexiones Netlogon no seguras.</w:t>
+      </w:r>
+    </w:p>
+    <w:p>
+      <w:pPr>
+        <w:spacing w:after="60" w:line="278" w:lineRule="auto"/>
+        <w:ind w:left="360" w:hanging="216"/>
+        <w:jc w:val="both"/>
+      </w:pPr>
+      <w:r>
+        <w:rPr>
+          <w:b/>
+          <w:color w:val="1B365D"/>
+        </w:rPr>
+        <w:t xml:space="preserve">•  </w:t>
+      </w:r>
+      <w:r>
+        <w:rPr>
+          <w:b/>
+          <w:color w:val="1E1E1E"/>
+        </w:rPr>
+        <w:t xml:space="preserve">Monitoreo y detección en logs: </w:t>
+      </w:r>
+      <w:r>
+        <w:rPr>
+          <w:color w:val="1E1E1E"/>
+        </w:rPr>
+        <w:t>Auditar en los Controladores de Dominio los eventos de seguridad de Windows con los IDs 4742 (“A computer account was changed”) y los IDs específicos de Netlogon (5827, 5828, 5829 y 5830) que alertan sobre intentos de autenticación RPC insegura.</w:t>
+      </w:r>
+    </w:p>
+    <w:p>
+      <w:r>
+        <w:br w:type="page"/>
+      </w:r>
+    </w:p>
+    <w:p>
+      <w:pPr>
+        <w:keepNext/>
+        <w:spacing w:before="220" w:after="80"/>
+      </w:pPr>
+      <w:r>
+        <w:rPr>
+          <w:rFonts w:ascii="Arial" w:hAnsi="Arial"/>
+          <w:b/>
+          <w:color w:val="1B365D"/>
+          <w:sz w:val="24"/>
+        </w:rPr>
+        <w:t>1.5. CVE-2019-0708: BlueKeep en Servicios de Escritorio Remoto (RDP)</w:t>
+      </w:r>
+    </w:p>
+    <w:p>
+      <w:pPr>
+        <w:spacing w:after="90" w:line="283" w:lineRule="auto"/>
+        <w:jc w:val="both"/>
+      </w:pPr>
+      <w:r>
+        <w:rPr>
+          <w:b/>
+          <w:color w:val="1E1E1E"/>
+        </w:rPr>
+        <w:t xml:space="preserve">¿Qué se ve afectado y de qué manera? </w:t>
+      </w:r>
+      <w:r>
+        <w:rPr>
+          <w:i w:val="0"/>
+          <w:color w:val="1E1E1E"/>
+        </w:rPr>
+        <w:t>Afecta a los Servicios de Escritorio Remoto (RDP) en sistemas operativos anteriores a Windows 8: principalmente Windows 7, Windows XP, Windows Server 2008 y Windows Server 2003.</w:t>
+      </w:r>
+    </w:p>
+    <w:p>
+      <w:pPr>
+        <w:spacing w:after="90" w:line="283" w:lineRule="auto"/>
+        <w:jc w:val="both"/>
+      </w:pPr>
+      <w:r>
+        <w:rPr>
+          <w:i w:val="0"/>
+          <w:color w:val="1E1E1E"/>
+        </w:rPr>
+        <w:t>El fallo reside en el controlador termdd.sys. Ocurre durante la fase de negociación inicial del canal RDP (canal virtual estático interno MS_T120), antes de cualquier autenticación de usuario. Un atacante envía solicitudes maliciosas al puerto RDP (por defecto TCP 3389) provocando una condición de uso de memoria después de ser liberada (Use-After-Free). Esto permite ejecutar código arbitrario en modo kernel o provocar un fallo catastrófico inmediato del sistema (Blue Screen of Death o BSOD).</w:t>
+      </w:r>
+    </w:p>
+    <w:p>
+      <w:pPr>
+        <w:keepNext/>
+        <w:spacing w:before="120" w:after="40"/>
+      </w:pPr>
+      <w:r>
+        <w:rPr>
+          <w:rFonts w:ascii="Arial" w:hAnsi="Arial"/>
+          <w:b/>
+          <w:color w:val="1B365D"/>
+          <w:sz w:val="21"/>
+        </w:rPr>
+        <w:t>Problemática principal:</w:t>
+      </w:r>
+    </w:p>
+    <w:p>
+      <w:pPr>
+        <w:spacing w:after="90" w:line="283" w:lineRule="auto"/>
+        <w:jc w:val="both"/>
+      </w:pPr>
+      <w:r>
+        <w:rPr>
+          <w:i w:val="0"/>
+          <w:color w:val="1E1E1E"/>
+        </w:rPr>
+        <w:t>Al igual que EternalBlue, es pre-autenticación y potencialmente propagable (wormable). El riesgo crítico se dispara cuando organizaciones dejan servidores o estaciones con RDP expuestos directamente a Internet sin una VPN, permitiendo que escáneres masivos comprometan el equipo perimetral como punto de entrada inicial a la infraestructura.</w:t>
+      </w:r>
+    </w:p>
+    <w:p>
+      <w:pPr>
+        <w:keepNext/>
+        <w:spacing w:before="120" w:after="40"/>
+      </w:pPr>
+      <w:r>
+        <w:rPr>
+          <w:rFonts w:ascii="Arial" w:hAnsi="Arial"/>
+          <w:b/>
+          <w:color w:val="1B365D"/>
+          <w:sz w:val="21"/>
+        </w:rPr>
+        <w:t>Ejemplos reales de explotación:</w:t>
+      </w:r>
+    </w:p>
+    <w:p>
+      <w:pPr>
+        <w:spacing w:after="60" w:line="278" w:lineRule="auto"/>
+        <w:ind w:left="360" w:hanging="216"/>
+        <w:jc w:val="both"/>
+      </w:pPr>
+      <w:r>
+        <w:rPr>
+          <w:b/>
+          <w:color w:val="1B365D"/>
+        </w:rPr>
+        <w:t xml:space="preserve">•  </w:t>
+      </w:r>
+      <w:r>
+        <w:rPr>
+          <w:b/>
+          <w:color w:val="1E1E1E"/>
+        </w:rPr>
+        <w:t xml:space="preserve">Campañas de criptominería masiva (finales de 2019): </w:t>
+      </w:r>
+      <w:r>
+        <w:rPr>
+          <w:color w:val="1E1E1E"/>
+        </w:rPr>
+        <w:t>Aunque no desató un brote global destructivo del calibre de WannaCry gracias a la rápida respuesta de parches, grupos cibercriminales utilizaron módulos de BlueKeep (como el desarrollado para Metasploit) para escanear Internet, infectar servidores desprotegidos e instalar mineros de criptomonedas (Monero) en segundo plano.</w:t>
+      </w:r>
+    </w:p>
+    <w:p>
+      <w:pPr>
+        <w:spacing w:after="60" w:line="278" w:lineRule="auto"/>
+        <w:ind w:left="360" w:hanging="216"/>
+        <w:jc w:val="both"/>
+      </w:pPr>
+      <w:r>
+        <w:rPr>
+          <w:b/>
+          <w:color w:val="1B365D"/>
+        </w:rPr>
+        <w:t xml:space="preserve">•  </w:t>
+      </w:r>
+      <w:r>
+        <w:rPr>
+          <w:b/>
+          <w:color w:val="1E1E1E"/>
+        </w:rPr>
+        <w:t xml:space="preserve">Ataques de denegación de servicio (DoS): </w:t>
+      </w:r>
+      <w:r>
+        <w:rPr>
+          <w:color w:val="1E1E1E"/>
+        </w:rPr>
+        <w:t>Debido a que la memoria del kernel es inestable, muchos intentos fallidos de explotación por parte de actores de amenazas causaron caídas masivas (pantallazos azules) en servidores críticos de producción.</w:t>
+      </w:r>
+    </w:p>
+    <w:p>
+      <w:pPr>
+        <w:keepNext/>
+        <w:spacing w:before="120" w:after="40"/>
+      </w:pPr>
+      <w:r>
+        <w:rPr>
+          <w:rFonts w:ascii="Arial" w:hAnsi="Arial"/>
+          <w:b/>
+          <w:color w:val="1B365D"/>
+          <w:sz w:val="21"/>
+        </w:rPr>
+        <w:t>Mitigación y prevención:</w:t>
+      </w:r>
+    </w:p>
+    <w:p>
+      <w:pPr>
+        <w:spacing w:after="60" w:line="278" w:lineRule="auto"/>
+        <w:ind w:left="360" w:hanging="216"/>
+        <w:jc w:val="both"/>
+      </w:pPr>
+      <w:r>
+        <w:rPr>
+          <w:b/>
+          <w:color w:val="1B365D"/>
+        </w:rPr>
+        <w:t xml:space="preserve">•  </w:t>
+      </w:r>
+      <w:r>
+        <w:rPr>
+          <w:b/>
+          <w:color w:val="1E1E1E"/>
+        </w:rPr>
+        <w:t xml:space="preserve">Aplicar el parche oficial: </w:t>
+      </w:r>
+      <w:r>
+        <w:rPr>
+          <w:color w:val="1E1E1E"/>
+        </w:rPr>
+        <w:t>Instalar las actualizaciones de seguridad de Microsoft de mayo de 2019 (disponibles en el boletín oficial de BlueKeep, incluso con parches fuera de soporte para Windows XP y Server 2003).</w:t>
+      </w:r>
+    </w:p>
+    <w:p>
+      <w:pPr>
+        <w:spacing w:after="60" w:line="278" w:lineRule="auto"/>
+        <w:ind w:left="360" w:hanging="216"/>
+        <w:jc w:val="both"/>
+      </w:pPr>
+      <w:r>
+        <w:rPr>
+          <w:b/>
+          <w:color w:val="1B365D"/>
+        </w:rPr>
+        <w:t xml:space="preserve">•  </w:t>
+      </w:r>
+      <w:r>
+        <w:rPr>
+          <w:b/>
+          <w:color w:val="1E1E1E"/>
+        </w:rPr>
+        <w:t xml:space="preserve">Habilitar NLA (Network Level Authentication): </w:t>
+      </w:r>
+      <w:r>
+        <w:rPr>
+          <w:color w:val="1E1E1E"/>
+        </w:rPr>
+        <w:t>Exigir Autenticación a Nivel de Red para RDP. NLA obliga al cliente a autenticarse contra el sistema operativo antes de establecer el canal RDP, mitigando por completo la ejecución remota de código no autenticada.</w:t>
+      </w:r>
+    </w:p>
+    <w:p>
+      <w:pPr>
+        <w:spacing w:after="60" w:line="278" w:lineRule="auto"/>
+        <w:ind w:left="360" w:hanging="216"/>
+        <w:jc w:val="both"/>
+      </w:pPr>
+      <w:r>
+        <w:rPr>
+          <w:b/>
+          <w:color w:val="1B365D"/>
+        </w:rPr>
+        <w:t xml:space="preserve">•  </w:t>
+      </w:r>
+      <w:r>
+        <w:rPr>
+          <w:b/>
+          <w:color w:val="1E1E1E"/>
+        </w:rPr>
+        <w:t xml:space="preserve">Cerrar RDP a Internet: </w:t>
+      </w:r>
+      <w:r>
+        <w:rPr>
+          <w:color w:val="1E1E1E"/>
+        </w:rPr>
+        <w:t>No exponer el puerto TCP 3389 a redes públicas; acceder siempre mediante una VPN corporativa con autenticación multifactor (MFA) o mediante soluciones de acceso tipo Bastion / ZTNA.</w:t>
       </w:r>
     </w:p>
     <w:p>
@@ -2967,7 +3669,7 @@
         <w:rPr>
           <w:color w:val="1E1E1E"/>
         </w:rPr>
-        <w:t>Base Nacional de Vulnerabilidades (registros CVE-2017-0144, CVE-2021-41773, CVE-2021-42013 y CVE-2021-44228).</w:t>
+        <w:t>Base Nacional de Vulnerabilidades (registros CVE-2017-0144, CVE-2021-41773, CVE-2021-42013, CVE-2021-44228, CVE-2020-1472 y CVE-2019-0708).</w:t>
       </w:r>
     </w:p>
     <w:p>
@@ -3021,7 +3723,34 @@
         <w:rPr>
           <w:color w:val="1E1E1E"/>
         </w:rPr>
-        <w:t>Boletín de Seguridad MS17-010 (Crítico) para Windows SMB Server.</w:t>
+        <w:t>Boletín de Seguridad MS17-010 (EternalBlue), aviso oficial de BlueKeep (CVE-2019-0708) y actualización de Netlogon (CVE-2020-1472).</w:t>
+      </w:r>
+    </w:p>
+    <w:p>
+      <w:pPr>
+        <w:spacing w:after="60" w:line="278" w:lineRule="auto"/>
+        <w:ind w:left="360" w:hanging="216"/>
+        <w:jc w:val="both"/>
+      </w:pPr>
+      <w:r>
+        <w:rPr>
+          <w:b/>
+          <w:color w:val="1B365D"/>
+        </w:rPr>
+        <w:t xml:space="preserve">•  </w:t>
+      </w:r>
+      <w:r>
+        <w:rPr>
+          <w:b/>
+          <w:color w:val="1E1E1E"/>
+        </w:rPr>
+        <w:t xml:space="preserve">CISA (Cybersecurity and Infrastructure Security Agency): </w:t>
+      </w:r>
+      <w:r>
+        <w:rPr>
+          <w:color w:val="1E1E1E"/>
+        </w:rPr>
+        <w:t>Alertas de seguridad sobre explotación activa de Zerologon (AA20-296B).</w:t>
       </w:r>
     </w:p>
     <w:p>

</xml_diff>